<commit_message>
update task 3 script
</commit_message>
<xml_diff>
--- a/presentation/task3_script.docx
+++ b/presentation/task3_script.docx
@@ -3,20 +3,23 @@
 <w:document xmlns:wpc="http://schemas.microsoft.com/office/word/2010/wordprocessingCanvas" xmlns:cx="http://schemas.microsoft.com/office/drawing/2014/chartex" xmlns:cx1="http://schemas.microsoft.com/office/drawing/2015/9/8/chartex" xmlns:cx2="http://schemas.microsoft.com/office/drawing/2015/10/21/chartex" xmlns:cx3="http://schemas.microsoft.com/office/drawing/2016/5/9/chartex" xmlns:cx4="http://schemas.microsoft.com/office/drawing/2016/5/10/chartex" xmlns:cx5="http://schemas.microsoft.com/office/drawing/2016/5/11/chartex" xmlns:cx6="http://schemas.microsoft.com/office/drawing/2016/5/12/chartex" xmlns:cx7="http://schemas.microsoft.com/office/drawing/2016/5/13/chartex" xmlns:cx8="http://schemas.microsoft.com/office/drawing/2016/5/14/chartex" xmlns:mc="http://schemas.openxmlformats.org/markup-compatibility/2006" xmlns:aink="http://schemas.microsoft.com/office/drawing/2016/ink" xmlns:am3d="http://schemas.microsoft.com/office/drawing/2017/model3d" xmlns:o="urn:schemas-microsoft-com:office:office" xmlns:oel="http://schemas.microsoft.com/office/2019/extlst" xmlns:r="http://schemas.openxmlformats.org/officeDocument/2006/relationships" xmlns:m="http://schemas.openxmlformats.org/officeDocument/2006/math" xmlns:v="urn:schemas-microsoft-com:vml" xmlns:wp14="http://schemas.microsoft.com/office/word/2010/wordprocessingDrawing" xmlns:wp="http://schemas.openxmlformats.org/drawingml/2006/wordprocessingDrawing" xmlns:w10="urn:schemas-microsoft-com:office:word" xmlns:w="http://schemas.openxmlformats.org/wordprocessingml/2006/main" xmlns:w14="http://schemas.microsoft.com/office/word/2010/wordml" xmlns:w15="http://schemas.microsoft.com/office/word/2012/wordml" xmlns:w16cei="http://schemas.microsoft.com/office/word/2026/wordml/cei" xmlns:w16cex="http://schemas.microsoft.com/office/word/2018/wordml/cex" xmlns:w16cid="http://schemas.microsoft.com/office/word/2016/wordml/cid" xmlns:w16="http://schemas.microsoft.com/office/word/2018/wordml" xmlns:w16du="http://schemas.microsoft.com/office/word/2023/wordml/word16du" xmlns:w16sdtdh="http://schemas.microsoft.com/office/word/2020/wordml/sdtdatahash" xmlns:w16sdtfl="http://schemas.microsoft.com/office/word/2024/wordml/sdtformatlock" xmlns:w16se="http://schemas.microsoft.com/office/word/2015/wordml/symex" xmlns:wpg="http://schemas.microsoft.com/office/word/2010/wordprocessingGroup" xmlns:wpi="http://schemas.microsoft.com/office/word/2010/wordprocessingInk" xmlns:wne="http://schemas.microsoft.com/office/word/2006/wordml" xmlns:wps="http://schemas.microsoft.com/office/word/2010/wordprocessingShape" mc:Ignorable="w14 w15 w16se w16cid w16 w16cex w16sdtdh w16sdtfl w16du wp14">
   <w:body>
     <w:p>
+      <w:pPr>
+        <w:rPr>
+          <w:b/>
+          <w:bCs/>
+        </w:rPr>
+      </w:pPr>
       <w:r>
         <w:rPr>
           <w:b/>
           <w:bCs/>
         </w:rPr>
-        <w:t>(Slide 1: Serial vs. OpenMP with Size of n)</w:t>
-      </w:r>
-      <w:r>
-        <w:t xml:space="preserve"> </w:t>
+        <w:t xml:space="preserve">(Slide 1: Serial vs. OpenMP with Size of n) </w:t>
       </w:r>
     </w:p>
     <w:p>
       <w:r>
-        <w:t xml:space="preserve">Moving to Task 3, we optimized our implementation using OpenMP. As shown, OpenMP maintains near-flat execution times across both architectures, scaling up to only 3.49 seconds on the 8-core machine and 0.75 seconds on the 32-core machine at </w:t>
+        <w:t xml:space="preserve">Moving to Task 3, OpenMP maintains near-flat execution times, scaling to only 3.49 seconds on the 8-core and 0.75 seconds on the 32-core machine at </w:t>
       </w:r>
       <m:oMath>
         <m:r>
@@ -33,52 +36,49 @@
         </m:r>
       </m:oMath>
       <w:r>
-        <w:t xml:space="preserve">. This flat profile demonstrates that dynamic loop scheduling effectively distributes non-uniform prime computations, preventing </w:t>
-      </w:r>
-      <w:r>
-        <w:rPr>
-          <w:rFonts w:hint="eastAsia"/>
-        </w:rPr>
-        <w:t xml:space="preserve">thread </w:t>
-      </w:r>
-      <w:r>
-        <w:t xml:space="preserve">idle time. </w:t>
+        <w:t xml:space="preserve">. Dynamic scheduling handles the uneven prime checks cleanly, eliminating thread idle time. </w:t>
       </w:r>
     </w:p>
     <w:p/>
     <w:p>
+      <w:pPr>
+        <w:rPr>
+          <w:b/>
+          <w:bCs/>
+        </w:rPr>
+      </w:pPr>
       <w:r>
         <w:rPr>
           <w:b/>
           <w:bCs/>
         </w:rPr>
-        <w:t>(Slide 2: Speedup Factor Analysis)</w:t>
-      </w:r>
-      <w:r>
-        <w:t xml:space="preserve"> </w:t>
+        <w:t xml:space="preserve">(Slide 2: Speedup Factor Analysis) </w:t>
       </w:r>
     </w:p>
     <w:p>
       <w:r>
-        <w:t xml:space="preserve">Examining the speedup factor: the 8-core machine achieves a stable speedup around 4.2x to 5.0x, closely approaching its physical hardware limits. Meanwhile, the 32-core system scales up to 15.75x. The fluctuations on the 32-core machine reflect dynamic scheduling overhead and NUMA memory latency when distributing tasks across high thread counts. </w:t>
+        <w:t xml:space="preserve">For speedup, the 8-core machine achieves a steady 4.2x to 5.0x, near its physical limits, while the 32-core system scales up to 15.75x. Fluctuations on the 32-core machine reflect NUMA latency and dynamic chunk distribution across high core counts. </w:t>
       </w:r>
     </w:p>
     <w:p/>
     <w:p>
+      <w:pPr>
+        <w:rPr>
+          <w:b/>
+          <w:bCs/>
+        </w:rPr>
+      </w:pPr>
       <w:r>
         <w:rPr>
           <w:b/>
           <w:bCs/>
         </w:rPr>
-        <w:t>(Slide 3: POSIX Threads vs. OpenMP with Size of n)</w:t>
-      </w:r>
-      <w:r>
-        <w:t xml:space="preserve"> </w:t>
+        <w:t xml:space="preserve">(Slide 3: POSIX Threads vs. OpenMP with Size of n) </w:t>
       </w:r>
     </w:p>
     <w:p>
       <w:r>
-        <w:t xml:space="preserve">Comparing OpenMP directly with POSIX Threads across problem sizes, OpenMP consistently maintains a clear computational lead. This performance advantage stems from batch chunking (schedule(dynamic, 500)), which eliminates cache line invalidations—known as False Sharing—inherent in stride-1 cyclic partitioning. </w:t>
+        <w:t xml:space="preserve">Comparing OpenMP with POSIX, OpenMP holds a consistent performance lead. Batch chunking (dynamic, 500) eliminates the cache invalidations and False Sharing caused by stride-1 cyclic partitioning. </w:t>
       </w:r>
     </w:p>
     <w:p/>
@@ -99,7 +99,7 @@
     </w:p>
     <w:p>
       <w:r>
-        <w:t>Finally, evaluating scalability across thread counts. At 1 thread, OpenMP exhibits a slight runtime overhead due to internal team management. However, from 4 to 64 threads, OpenMP converges to optimal throughput significantly faster than POSIX, achieving a best time of 0.14 seconds on the 32-core machine. This concludes Task 3</w:t>
+        <w:t xml:space="preserve">Across thread counts, OpenMP converges to peak performance faster, reaching an optimal 0.14 seconds on the 32-core machine. This concludes Task 3. </w:t>
       </w:r>
     </w:p>
     <w:p/>

</xml_diff>